<commit_message>
Début de creation des threads sur le cryptage mais probleme de reconstitution lors du decryptage
</commit_message>
<xml_diff>
--- a/details_prog.docx
+++ b/details_prog.docx
@@ -538,55 +538,6 @@
           <w:color w:val="000000" w:themeColor="text1"/>
         </w:rPr>
       </w:pPr>
-      <w:r>
-        <w:rPr>
-          <w:color w:val="000000" w:themeColor="text1"/>
-        </w:rPr>
-        <w:t xml:space="preserve">Le fait de vouloir faire un programme de cryptage de fichier nous avons donc due utiliser une bibliothèque d’interface graphique afin de pouvoir sélectionner les fichiers et de les crypter. Notre choix a été tkinter du a son utilisation assez intuitive et poussé. Cette bibliothèque nous a </w:t>
-      </w:r>
-      <w:r>
-        <w:rPr>
-          <w:color w:val="000000" w:themeColor="text1"/>
-        </w:rPr>
-        <w:lastRenderedPageBreak/>
-        <w:t xml:space="preserve">permis d’obtenir une fenêtre ou l’on peut choisir le fichier </w:t>
-      </w:r>
-      <w:r>
-        <w:rPr>
-          <w:color w:val="000000" w:themeColor="text1"/>
-        </w:rPr>
-        <w:t>à</w:t>
-      </w:r>
-      <w:r>
-        <w:rPr>
-          <w:color w:val="000000" w:themeColor="text1"/>
-        </w:rPr>
-        <w:t xml:space="preserve"> crypter directement dans </w:t>
-      </w:r>
-      <w:r>
-        <w:rPr>
-          <w:color w:val="000000" w:themeColor="text1"/>
-        </w:rPr>
-        <w:t>l’explorateur de</w:t>
-      </w:r>
-      <w:r>
-        <w:rPr>
-          <w:color w:val="000000" w:themeColor="text1"/>
-        </w:rPr>
-        <w:t xml:space="preserve"> fichier et ensuite de le crypter en appuyant sur le bouton prévu </w:t>
-      </w:r>
-      <w:r>
-        <w:rPr>
-          <w:color w:val="000000" w:themeColor="text1"/>
-        </w:rPr>
-        <w:t>à</w:t>
-      </w:r>
-      <w:r>
-        <w:rPr>
-          <w:color w:val="000000" w:themeColor="text1"/>
-        </w:rPr>
-        <w:t xml:space="preserve"> cet effet.</w:t>
-      </w:r>
     </w:p>
     <w:p>
       <w:pPr>
@@ -598,7 +549,116 @@
         <w:rPr>
           <w:color w:val="000000" w:themeColor="text1"/>
         </w:rPr>
-        <w:t>Nous avons aussi utilisé la bibliothèque os qui nous a permis de traiter tout ce qui tourner autour des fichiers et des dossiers d’enregistrement. Cela nous a permis de réaliser les actions voulu le plus simplement possible.</w:t>
+        <w:lastRenderedPageBreak/>
+        <w:t xml:space="preserve">Le fait de vouloir faire un programme de cryptage de fichier nous avons donc due utiliser </w:t>
+      </w:r>
+      <w:r>
+        <w:rPr>
+          <w:color w:val="000000" w:themeColor="text1"/>
+        </w:rPr>
+        <w:t xml:space="preserve">différentes </w:t>
+      </w:r>
+      <w:r>
+        <w:rPr>
+          <w:color w:val="000000" w:themeColor="text1"/>
+        </w:rPr>
+        <w:t>bibliothèque</w:t>
+      </w:r>
+      <w:r>
+        <w:rPr>
+          <w:color w:val="000000" w:themeColor="text1"/>
+        </w:rPr>
+        <w:t xml:space="preserve">s. Tout d’abord la </w:t>
+      </w:r>
+      <w:r>
+        <w:rPr>
+          <w:color w:val="000000" w:themeColor="text1"/>
+        </w:rPr>
+        <w:t>bibliothèque</w:t>
+      </w:r>
+      <w:r>
+        <w:rPr>
+          <w:color w:val="000000" w:themeColor="text1"/>
+        </w:rPr>
+        <w:t xml:space="preserve"> OS qui permet de traiter tout ce qui tourn</w:t>
+      </w:r>
+      <w:r>
+        <w:rPr>
+          <w:color w:val="000000" w:themeColor="text1"/>
+        </w:rPr>
+        <w:t xml:space="preserve">e </w:t>
+      </w:r>
+      <w:r>
+        <w:rPr>
+          <w:color w:val="000000" w:themeColor="text1"/>
+        </w:rPr>
+        <w:t xml:space="preserve">autour des fichiers </w:t>
+      </w:r>
+      <w:r>
+        <w:rPr>
+          <w:color w:val="000000" w:themeColor="text1"/>
+        </w:rPr>
+        <w:t>et des dossiers de la manière la plus simple possible et cela dans</w:t>
+      </w:r>
+      <w:r>
+        <w:rPr>
+          <w:color w:val="000000" w:themeColor="text1"/>
+        </w:rPr>
+        <w:t xml:space="preserve"> </w:t>
+      </w:r>
+      <w:r>
+        <w:rPr>
+          <w:color w:val="000000" w:themeColor="text1"/>
+        </w:rPr>
+        <w:t>n’importe</w:t>
+      </w:r>
+      <w:r>
+        <w:rPr>
+          <w:color w:val="000000" w:themeColor="text1"/>
+        </w:rPr>
+        <w:t xml:space="preserve"> quel système d’exploitation. Il nous a ensuite fallu utiliser une bibliothèque pour l’interface graphique </w:t>
+      </w:r>
+      <w:r>
+        <w:rPr>
+          <w:color w:val="000000" w:themeColor="text1"/>
+        </w:rPr>
+        <w:t xml:space="preserve">afin de pouvoir sélectionner les fichiers et de les crypter. Notre choix a été tkinter du a son utilisation assez intuitive et poussé. Cette bibliothèque nous a permis d’obtenir une fenêtre ou l’on peut choisir le fichier </w:t>
+      </w:r>
+      <w:r>
+        <w:rPr>
+          <w:color w:val="000000" w:themeColor="text1"/>
+        </w:rPr>
+        <w:t>à</w:t>
+      </w:r>
+      <w:r>
+        <w:rPr>
+          <w:color w:val="000000" w:themeColor="text1"/>
+        </w:rPr>
+        <w:t xml:space="preserve"> crypter directement dans </w:t>
+      </w:r>
+      <w:r>
+        <w:rPr>
+          <w:color w:val="000000" w:themeColor="text1"/>
+        </w:rPr>
+        <w:t>l’explorateur de</w:t>
+      </w:r>
+      <w:r>
+        <w:rPr>
+          <w:color w:val="000000" w:themeColor="text1"/>
+        </w:rPr>
+        <w:t xml:space="preserve"> fichier et ensuite de le crypter en appuyant sur le bouton prévu </w:t>
+      </w:r>
+      <w:r>
+        <w:rPr>
+          <w:color w:val="000000" w:themeColor="text1"/>
+        </w:rPr>
+        <w:t>à</w:t>
+      </w:r>
+      <w:r>
+        <w:rPr>
+          <w:color w:val="000000" w:themeColor="text1"/>
+        </w:rPr>
+        <w:t xml:space="preserve"> cet effet.</w:t>
       </w:r>
     </w:p>
     <w:p>
@@ -783,7 +843,19 @@
         <w:rPr>
           <w:color w:val="000000" w:themeColor="text1"/>
         </w:rPr>
-        <w:t xml:space="preserve"> Ils permettent à partir du fichier et des dossier sélectionné de crypter ou décrypter le fichier voulu.</w:t>
+        <w:t xml:space="preserve"> Ils permettent à partir du fichier et des dossier sélectionné</w:t>
+      </w:r>
+      <w:r>
+        <w:rPr>
+          <w:color w:val="000000" w:themeColor="text1"/>
+        </w:rPr>
+        <w:t>s</w:t>
+      </w:r>
+      <w:r>
+        <w:rPr>
+          <w:color w:val="000000" w:themeColor="text1"/>
+        </w:rPr>
+        <w:t xml:space="preserve"> de crypter ou décrypter le fichier voulu.</w:t>
       </w:r>
     </w:p>
     <w:p>

</xml_diff>

<commit_message>
cryptage en thread normalement reussi, probleme lors du decryptage au debut morceaux de fichiers manquants et maintenant problemes de clés, legere modif prog principale due a des modifications de fct dans les deux autres programmes
</commit_message>
<xml_diff>
--- a/details_prog.docx
+++ b/details_prog.docx
@@ -146,21 +146,7 @@
         <w:rPr>
           <w:color w:val="000000" w:themeColor="text1"/>
         </w:rPr>
-        <w:t xml:space="preserve">symétrique. Celle-ci permet le cryptage de fichier et un stockage sécurisé. Ce type est sécurisé car il est mathématiquement complexe. Ce type de cryptage est possible avec deux algorithmes diffèrent. Le AES et le </w:t>
-      </w:r>
-      <w:proofErr w:type="spellStart"/>
-      <w:r>
-        <w:rPr>
-          <w:color w:val="000000" w:themeColor="text1"/>
-        </w:rPr>
-        <w:t>Fernet</w:t>
-      </w:r>
-      <w:proofErr w:type="spellEnd"/>
-      <w:r>
-        <w:rPr>
-          <w:color w:val="000000" w:themeColor="text1"/>
-        </w:rPr>
-        <w:t xml:space="preserve">. Le type AES est un algorithme qui supporte </w:t>
+        <w:t xml:space="preserve">symétrique. Celle-ci permet le cryptage de fichier et un stockage sécurisé. Ce type est sécurisé car il est mathématiquement complexe. Ce type de cryptage est possible avec deux algorithmes diffèrent. Le AES et le Fernet. Le type AES est un algorithme qui supporte </w:t>
       </w:r>
       <w:r>
         <w:rPr>
@@ -184,96 +170,50 @@
         <w:rPr>
           <w:color w:val="000000" w:themeColor="text1"/>
         </w:rPr>
-        <w:t xml:space="preserve"> de chiffrement par exemple ECB (</w:t>
-      </w:r>
-      <w:proofErr w:type="spellStart"/>
-      <w:r>
-        <w:rPr>
-          <w:color w:val="000000" w:themeColor="text1"/>
-        </w:rPr>
-        <w:t>Electronic</w:t>
-      </w:r>
-      <w:proofErr w:type="spellEnd"/>
+        <w:t xml:space="preserve"> de chiffrement par exemple ECB (Electronic CodeBook) : chiffre chaque bloc de 128 bits indépendamment avec la même clé, rapide mais peu sécurisé. Mais aussi CBC (Cipher Block Chaining) : chaque bloc crypté </w:t>
+      </w:r>
+      <w:r>
+        <w:rPr>
+          <w:color w:val="000000" w:themeColor="text1"/>
+        </w:rPr>
+        <w:t>dépend</w:t>
+      </w:r>
+      <w:r>
+        <w:rPr>
+          <w:color w:val="000000" w:themeColor="text1"/>
+        </w:rPr>
+        <w:t xml:space="preserve"> du bloc </w:t>
+      </w:r>
+      <w:r>
+        <w:rPr>
+          <w:color w:val="000000" w:themeColor="text1"/>
+        </w:rPr>
+        <w:t xml:space="preserve">précèdent, beaucoup plus sécurisé que le ECB mais plus lent du au traitement séquentielle des blocs. Il y a aussi CFB, OFB … </w:t>
+      </w:r>
+      <w:r>
+        <w:rPr>
+          <w:color w:val="000000" w:themeColor="text1"/>
+        </w:rPr>
+        <w:t>Fern</w:t>
+      </w:r>
+      <w:r>
+        <w:rPr>
+          <w:color w:val="000000" w:themeColor="text1"/>
+        </w:rPr>
+        <w:t>et</w:t>
+      </w:r>
       <w:r>
         <w:rPr>
           <w:color w:val="000000" w:themeColor="text1"/>
         </w:rPr>
         <w:t xml:space="preserve"> </w:t>
       </w:r>
-      <w:proofErr w:type="spellStart"/>
-      <w:r>
-        <w:rPr>
-          <w:color w:val="000000" w:themeColor="text1"/>
-        </w:rPr>
-        <w:t>CodeBook</w:t>
-      </w:r>
-      <w:proofErr w:type="spellEnd"/>
-      <w:r>
-        <w:rPr>
-          <w:color w:val="000000" w:themeColor="text1"/>
-        </w:rPr>
-        <w:t>) : chiffre chaque bloc de 128 bits indépendamment avec la même clé, rapide mais peu sécurisé. Mais aussi CBC (</w:t>
-      </w:r>
-      <w:proofErr w:type="spellStart"/>
-      <w:r>
-        <w:rPr>
-          <w:color w:val="000000" w:themeColor="text1"/>
-        </w:rPr>
-        <w:t>Cipher</w:t>
-      </w:r>
-      <w:proofErr w:type="spellEnd"/>
-      <w:r>
-        <w:rPr>
-          <w:color w:val="000000" w:themeColor="text1"/>
-        </w:rPr>
-        <w:t xml:space="preserve"> Block </w:t>
-      </w:r>
-      <w:proofErr w:type="spellStart"/>
-      <w:r>
-        <w:rPr>
-          <w:color w:val="000000" w:themeColor="text1"/>
-        </w:rPr>
-        <w:t>Chaining</w:t>
-      </w:r>
-      <w:proofErr w:type="spellEnd"/>
-      <w:r>
-        <w:rPr>
-          <w:color w:val="000000" w:themeColor="text1"/>
-        </w:rPr>
-        <w:t xml:space="preserve">) : chaque bloc crypté </w:t>
-      </w:r>
-      <w:r>
-        <w:rPr>
-          <w:color w:val="000000" w:themeColor="text1"/>
-        </w:rPr>
-        <w:t>dépend</w:t>
-      </w:r>
-      <w:r>
-        <w:rPr>
-          <w:color w:val="000000" w:themeColor="text1"/>
-        </w:rPr>
-        <w:t xml:space="preserve"> du bloc </w:t>
-      </w:r>
-      <w:r>
-        <w:rPr>
-          <w:color w:val="000000" w:themeColor="text1"/>
-        </w:rPr>
-        <w:t xml:space="preserve">précèdent, beaucoup plus sécurisé que le ECB mais plus lent du au traitement séquentielle des blocs. Il y a aussi CFB, OFB … </w:t>
-      </w:r>
-      <w:proofErr w:type="spellStart"/>
-      <w:r>
-        <w:rPr>
-          <w:color w:val="000000" w:themeColor="text1"/>
-        </w:rPr>
-        <w:t>Fern</w:t>
-      </w:r>
-      <w:r>
-        <w:rPr>
-          <w:color w:val="000000" w:themeColor="text1"/>
-        </w:rPr>
-        <w:t>et</w:t>
-      </w:r>
-      <w:proofErr w:type="spellEnd"/>
+      <w:r>
+        <w:rPr>
+          <w:color w:val="000000" w:themeColor="text1"/>
+        </w:rPr>
+        <w:t>quant</w:t>
+      </w:r>
       <w:r>
         <w:rPr>
           <w:color w:val="000000" w:themeColor="text1"/>
@@ -284,18 +224,6 @@
         <w:rPr>
           <w:color w:val="000000" w:themeColor="text1"/>
         </w:rPr>
-        <w:t>quant</w:t>
-      </w:r>
-      <w:r>
-        <w:rPr>
-          <w:color w:val="000000" w:themeColor="text1"/>
-        </w:rPr>
-        <w:t xml:space="preserve"> </w:t>
-      </w:r>
-      <w:r>
-        <w:rPr>
-          <w:color w:val="000000" w:themeColor="text1"/>
-        </w:rPr>
         <w:t>à</w:t>
       </w:r>
       <w:r>
@@ -308,21 +236,7 @@
         <w:rPr>
           <w:color w:val="000000" w:themeColor="text1"/>
         </w:rPr>
-        <w:t xml:space="preserve">. </w:t>
-      </w:r>
-      <w:proofErr w:type="spellStart"/>
-      <w:r>
-        <w:rPr>
-          <w:color w:val="000000" w:themeColor="text1"/>
-        </w:rPr>
-        <w:t>Fernet</w:t>
-      </w:r>
-      <w:proofErr w:type="spellEnd"/>
-      <w:r>
-        <w:rPr>
-          <w:color w:val="000000" w:themeColor="text1"/>
-        </w:rPr>
-        <w:t xml:space="preserve"> permet de crypter des documents mais de vérifier avant cela si celui-ci est corrompue ou non.</w:t>
+        <w:t>. Fernet permet de crypter des documents mais de vérifier avant cela si celui-ci est corrompue ou non.</w:t>
       </w:r>
       <w:r>
         <w:rPr>
@@ -479,21 +393,7 @@
         <w:rPr>
           <w:color w:val="000000" w:themeColor="text1"/>
         </w:rPr>
-        <w:t xml:space="preserve"> RSA (Rivest Shamir-</w:t>
-      </w:r>
-      <w:proofErr w:type="spellStart"/>
-      <w:r>
-        <w:rPr>
-          <w:color w:val="000000" w:themeColor="text1"/>
-        </w:rPr>
-        <w:t>Adleman</w:t>
-      </w:r>
-      <w:proofErr w:type="spellEnd"/>
-      <w:r>
-        <w:rPr>
-          <w:color w:val="000000" w:themeColor="text1"/>
-        </w:rPr>
-        <w:t xml:space="preserve">) contrairement au cryptage </w:t>
+        <w:t xml:space="preserve"> RSA (Rivest Shamir-Adleman) contrairement au cryptage </w:t>
       </w:r>
       <w:r>
         <w:rPr>
@@ -641,21 +541,7 @@
         <w:rPr>
           <w:color w:val="000000" w:themeColor="text1"/>
         </w:rPr>
-        <w:t xml:space="preserve"> de ce fait nous avons choisis la méthode de cryptage symétrique avec </w:t>
-      </w:r>
-      <w:proofErr w:type="spellStart"/>
-      <w:r>
-        <w:rPr>
-          <w:color w:val="000000" w:themeColor="text1"/>
-        </w:rPr>
-        <w:t>Fernet</w:t>
-      </w:r>
-      <w:proofErr w:type="spellEnd"/>
-      <w:r>
-        <w:rPr>
-          <w:color w:val="000000" w:themeColor="text1"/>
-        </w:rPr>
-        <w:t>. D</w:t>
+        <w:t xml:space="preserve"> de ce fait nous avons choisis la méthode de cryptage symétrique avec Fernet. D</w:t>
       </w:r>
       <w:r>
         <w:rPr>
@@ -667,35 +553,7 @@
         <w:rPr>
           <w:color w:val="000000" w:themeColor="text1"/>
         </w:rPr>
-        <w:t xml:space="preserve"> nous nous sommes beaucoup moins préoccuper des autres méthodes possibles. En python il existe différentes bibliothèques de cryptage, nous avons pris le choix ici d’utiliser la bibliothèque </w:t>
-      </w:r>
-      <w:proofErr w:type="spellStart"/>
-      <w:r>
-        <w:rPr>
-          <w:color w:val="000000" w:themeColor="text1"/>
-        </w:rPr>
-        <w:t>cryptography</w:t>
-      </w:r>
-      <w:proofErr w:type="spellEnd"/>
-      <w:r>
-        <w:rPr>
-          <w:color w:val="000000" w:themeColor="text1"/>
-        </w:rPr>
-        <w:t xml:space="preserve"> qui contient les fonctions de </w:t>
-      </w:r>
-      <w:proofErr w:type="spellStart"/>
-      <w:r>
-        <w:rPr>
-          <w:color w:val="000000" w:themeColor="text1"/>
-        </w:rPr>
-        <w:t>Fernet</w:t>
-      </w:r>
-      <w:proofErr w:type="spellEnd"/>
-      <w:r>
-        <w:rPr>
-          <w:color w:val="000000" w:themeColor="text1"/>
-        </w:rPr>
-        <w:t>.</w:t>
+        <w:t xml:space="preserve"> nous nous sommes beaucoup moins préoccuper des autres méthodes possibles. En python il existe différentes bibliothèques de cryptage, nous avons pris le choix ici d’utiliser la bibliothèque cryptography qui contient les fonctions de Fernet.</w:t>
       </w:r>
     </w:p>
     <w:p>
@@ -788,21 +646,7 @@
         <w:rPr>
           <w:color w:val="000000" w:themeColor="text1"/>
         </w:rPr>
-        <w:t xml:space="preserve">afin de pouvoir sélectionner les fichiers et de les crypter. Notre choix a été </w:t>
-      </w:r>
-      <w:proofErr w:type="spellStart"/>
-      <w:r>
-        <w:rPr>
-          <w:color w:val="000000" w:themeColor="text1"/>
-        </w:rPr>
-        <w:t>tkinter</w:t>
-      </w:r>
-      <w:proofErr w:type="spellEnd"/>
-      <w:r>
-        <w:rPr>
-          <w:color w:val="000000" w:themeColor="text1"/>
-        </w:rPr>
-        <w:t xml:space="preserve"> du a son utilisation assez intuitive et poussé. Cette bibliothèque nous a permis d’obtenir une fenêtre ou l’on peut choisir le fichier </w:t>
+        <w:t xml:space="preserve">afin de pouvoir sélectionner les fichiers et de les crypter. Notre choix a été tkinter du a son utilisation assez intuitive et poussé. Cette bibliothèque nous a permis d’obtenir une fenêtre ou l’on peut choisir le fichier </w:t>
       </w:r>
       <w:r>
         <w:rPr>
@@ -1036,6 +880,26 @@
           <w:color w:val="000000" w:themeColor="text1"/>
         </w:rPr>
         <w:t xml:space="preserve"> de crypter ou décrypter le fichier voulu.</w:t>
+      </w:r>
+    </w:p>
+    <w:p>
+      <w:pPr>
+        <w:rPr>
+          <w:color w:val="000000" w:themeColor="text1"/>
+        </w:rPr>
+      </w:pPr>
+    </w:p>
+    <w:p>
+      <w:pPr>
+        <w:rPr>
+          <w:color w:val="000000" w:themeColor="text1"/>
+        </w:rPr>
+      </w:pPr>
+      <w:r>
+        <w:rPr>
+          <w:color w:val="000000" w:themeColor="text1"/>
+        </w:rPr>
+        <w:t>Afin de pouvoir partager la clé de cryptage nous avons decidé de crypter ce fichier d’une manieres plus simple avec simplement un decalage d’une certaine données de chgaque bytes de la clé de cryptage ce qui ne nécessite aucune clé de decryptage seulement le décalage utilisé a connaitre.</w:t>
       </w:r>
     </w:p>
     <w:p>

</xml_diff>

<commit_message>
Modif des progs mais ne marchent pas entre eux. se referer au nouveau prog 'full_code_test' pour voir le code fonctionnel
</commit_message>
<xml_diff>
--- a/details_prog.docx
+++ b/details_prog.docx
@@ -170,7 +170,70 @@
         <w:rPr>
           <w:color w:val="000000" w:themeColor="text1"/>
         </w:rPr>
-        <w:t xml:space="preserve"> de chiffrement par exemple ECB (Electronic CodeBook) : chiffre chaque bloc de 128 bits indépendamment avec la même clé, rapide mais peu sécurisé. Mais aussi CBC (Cipher Block Chaining) : chaque bloc crypté </w:t>
+        <w:t xml:space="preserve"> de chiffrement par exemple </w:t>
+      </w:r>
+      <w:bookmarkStart w:id="0" w:name="_Hlk197871220"/>
+      <w:r>
+        <w:rPr>
+          <w:color w:val="000000" w:themeColor="text1"/>
+        </w:rPr>
+        <w:t>ECB (</w:t>
+      </w:r>
+      <w:proofErr w:type="spellStart"/>
+      <w:r>
+        <w:rPr>
+          <w:color w:val="000000" w:themeColor="text1"/>
+        </w:rPr>
+        <w:t>Electronic</w:t>
+      </w:r>
+      <w:proofErr w:type="spellEnd"/>
+      <w:r>
+        <w:rPr>
+          <w:color w:val="000000" w:themeColor="text1"/>
+        </w:rPr>
+        <w:t xml:space="preserve"> </w:t>
+      </w:r>
+      <w:proofErr w:type="spellStart"/>
+      <w:r>
+        <w:rPr>
+          <w:color w:val="000000" w:themeColor="text1"/>
+        </w:rPr>
+        <w:t>CodeBook</w:t>
+      </w:r>
+      <w:proofErr w:type="spellEnd"/>
+      <w:r>
+        <w:rPr>
+          <w:color w:val="000000" w:themeColor="text1"/>
+        </w:rPr>
+        <w:t>) : chiffre chaque bloc de 128 bits indépendamment avec la même clé, rapide mais peu sécurisé. Mais aussi CBC (</w:t>
+      </w:r>
+      <w:proofErr w:type="spellStart"/>
+      <w:r>
+        <w:rPr>
+          <w:color w:val="000000" w:themeColor="text1"/>
+        </w:rPr>
+        <w:t>Cipher</w:t>
+      </w:r>
+      <w:proofErr w:type="spellEnd"/>
+      <w:r>
+        <w:rPr>
+          <w:color w:val="000000" w:themeColor="text1"/>
+        </w:rPr>
+        <w:t xml:space="preserve"> Block </w:t>
+      </w:r>
+      <w:proofErr w:type="spellStart"/>
+      <w:r>
+        <w:rPr>
+          <w:color w:val="000000" w:themeColor="text1"/>
+        </w:rPr>
+        <w:t>Chaining</w:t>
+      </w:r>
+      <w:proofErr w:type="spellEnd"/>
+      <w:r>
+        <w:rPr>
+          <w:color w:val="000000" w:themeColor="text1"/>
+        </w:rPr>
+        <w:t xml:space="preserve">) : chaque bloc crypté </w:t>
       </w:r>
       <w:r>
         <w:rPr>
@@ -188,7 +251,14 @@
         <w:rPr>
           <w:color w:val="000000" w:themeColor="text1"/>
         </w:rPr>
-        <w:t xml:space="preserve">précèdent, beaucoup plus sécurisé que le ECB mais plus lent du au traitement séquentielle des blocs. Il y a aussi CFB, OFB … </w:t>
+        <w:t xml:space="preserve">précèdent, beaucoup plus sécurisé que le ECB mais plus lent du au traitement séquentielle des blocs. </w:t>
+      </w:r>
+      <w:bookmarkEnd w:id="0"/>
+      <w:r>
+        <w:rPr>
+          <w:color w:val="000000" w:themeColor="text1"/>
+        </w:rPr>
+        <w:t xml:space="preserve">Il y a aussi CFB, OFB … </w:t>
       </w:r>
       <w:r>
         <w:rPr>
@@ -393,7 +463,21 @@
         <w:rPr>
           <w:color w:val="000000" w:themeColor="text1"/>
         </w:rPr>
-        <w:t xml:space="preserve"> RSA (Rivest Shamir-Adleman) contrairement au cryptage </w:t>
+        <w:t xml:space="preserve"> RSA (Rivest Shamir-</w:t>
+      </w:r>
+      <w:proofErr w:type="spellStart"/>
+      <w:r>
+        <w:rPr>
+          <w:color w:val="000000" w:themeColor="text1"/>
+        </w:rPr>
+        <w:t>Adleman</w:t>
+      </w:r>
+      <w:proofErr w:type="spellEnd"/>
+      <w:r>
+        <w:rPr>
+          <w:color w:val="000000" w:themeColor="text1"/>
+        </w:rPr>
+        <w:t xml:space="preserve">) contrairement au cryptage </w:t>
       </w:r>
       <w:r>
         <w:rPr>
@@ -509,14 +593,72 @@
     </w:p>
     <w:p>
       <w:pPr>
-        <w:rPr>
-          <w:color w:val="000000" w:themeColor="text1"/>
-        </w:rPr>
-      </w:pPr>
-      <w:r>
-        <w:rPr>
-          <w:color w:val="000000" w:themeColor="text1"/>
-        </w:rPr>
+        <w:pStyle w:val="Paragraphedeliste"/>
+        <w:rPr>
+          <w:color w:val="000000" w:themeColor="text1"/>
+        </w:rPr>
+      </w:pPr>
+    </w:p>
+    <w:p>
+      <w:pPr>
+        <w:pStyle w:val="Paragraphedeliste"/>
+        <w:rPr>
+          <w:color w:val="000000" w:themeColor="text1"/>
+        </w:rPr>
+      </w:pPr>
+    </w:p>
+    <w:p>
+      <w:pPr>
+        <w:pStyle w:val="Paragraphedeliste"/>
+        <w:rPr>
+          <w:color w:val="000000" w:themeColor="text1"/>
+        </w:rPr>
+      </w:pPr>
+    </w:p>
+    <w:p>
+      <w:pPr>
+        <w:pStyle w:val="Paragraphedeliste"/>
+        <w:rPr>
+          <w:color w:val="000000" w:themeColor="text1"/>
+        </w:rPr>
+      </w:pPr>
+    </w:p>
+    <w:p>
+      <w:pPr>
+        <w:pStyle w:val="Paragraphedeliste"/>
+        <w:rPr>
+          <w:color w:val="000000" w:themeColor="text1"/>
+        </w:rPr>
+      </w:pPr>
+    </w:p>
+    <w:p>
+      <w:pPr>
+        <w:pStyle w:val="Paragraphedeliste"/>
+        <w:rPr>
+          <w:color w:val="000000" w:themeColor="text1"/>
+        </w:rPr>
+      </w:pPr>
+    </w:p>
+    <w:p>
+      <w:pPr>
+        <w:pStyle w:val="Paragraphedeliste"/>
+        <w:rPr>
+          <w:color w:val="000000" w:themeColor="text1"/>
+        </w:rPr>
+      </w:pPr>
+    </w:p>
+    <w:p>
+      <w:pPr>
+        <w:rPr>
+          <w:color w:val="000000" w:themeColor="text1"/>
+        </w:rPr>
+      </w:pPr>
+      <w:bookmarkStart w:id="1" w:name="_Hlk197870997"/>
+      <w:r>
+        <w:rPr>
+          <w:color w:val="000000" w:themeColor="text1"/>
+        </w:rPr>
+        <w:lastRenderedPageBreak/>
         <w:t xml:space="preserve"> </w:t>
       </w:r>
       <w:r>
@@ -562,18 +704,10 @@
           <w:color w:val="000000" w:themeColor="text1"/>
         </w:rPr>
       </w:pPr>
-    </w:p>
-    <w:p>
-      <w:pPr>
-        <w:rPr>
-          <w:color w:val="000000" w:themeColor="text1"/>
-        </w:rPr>
-      </w:pPr>
-      <w:r>
-        <w:rPr>
-          <w:color w:val="000000" w:themeColor="text1"/>
-        </w:rPr>
-        <w:lastRenderedPageBreak/>
+      <w:r>
+        <w:rPr>
+          <w:color w:val="000000" w:themeColor="text1"/>
+        </w:rPr>
         <w:t xml:space="preserve">Le fait de vouloir faire un programme de cryptage de fichier nous avons donc due utiliser </w:t>
       </w:r>
       <w:r>
@@ -646,7 +780,21 @@
         <w:rPr>
           <w:color w:val="000000" w:themeColor="text1"/>
         </w:rPr>
-        <w:t xml:space="preserve">afin de pouvoir sélectionner les fichiers et de les crypter. Notre choix a été tkinter du a son utilisation assez intuitive et poussé. Cette bibliothèque nous a permis d’obtenir une fenêtre ou l’on peut choisir le fichier </w:t>
+        <w:t xml:space="preserve">afin de pouvoir sélectionner les fichiers et de les crypter. Notre choix a été </w:t>
+      </w:r>
+      <w:proofErr w:type="spellStart"/>
+      <w:r>
+        <w:rPr>
+          <w:color w:val="000000" w:themeColor="text1"/>
+        </w:rPr>
+        <w:t>tkinter</w:t>
+      </w:r>
+      <w:proofErr w:type="spellEnd"/>
+      <w:r>
+        <w:rPr>
+          <w:color w:val="000000" w:themeColor="text1"/>
+        </w:rPr>
+        <w:t xml:space="preserve"> du a son utilisation assez intuitive et poussé. Cette bibliothèque nous a permis d’obtenir une fenêtre ou l’on peut choisir le fichier </w:t>
       </w:r>
       <w:r>
         <w:rPr>
@@ -726,7 +874,25 @@
         <w:rPr>
           <w:color w:val="000000" w:themeColor="text1"/>
         </w:rPr>
-        <w:t xml:space="preserve">Pour la réalisation du projet nous avons choisis de séparer le programme en plusieurs fichiers afin d’alléger chaque partie du code. Nous avons donc créé un fichier pour les fonctions de cryptage, un de décryptage et un dernier contenant l’interface graphique ainsi que l’appel des différentes fonctions. </w:t>
+        <w:t>Pour la réalisation du projet nous avons choisis de séparer le programme en plusieurs fichiers afin d’alléger chaque partie du code. Nous avons donc créé</w:t>
+      </w:r>
+      <w:r>
+        <w:rPr>
+          <w:color w:val="000000" w:themeColor="text1"/>
+        </w:rPr>
+        <w:t xml:space="preserve"> en tout 4</w:t>
+      </w:r>
+      <w:r>
+        <w:rPr>
+          <w:color w:val="000000" w:themeColor="text1"/>
+        </w:rPr>
+        <w:t xml:space="preserve"> fichier</w:t>
+      </w:r>
+      <w:r>
+        <w:rPr>
+          <w:color w:val="000000" w:themeColor="text1"/>
+        </w:rPr>
+        <w:t>s. Un premier pour toutes les fonctions en rapport avec le cryptage, le second lui contient les fonctions nécessaires au décryptage, le 3eme lui contient toute l’interface graphique ainsi que les fonctions nécessaires au bon fonctionnement de celle-ci. Dans ce fichier nous importons les fonctions des deux autres fichiers afin de pouvoir les utiliser dans l’interface.</w:t>
       </w:r>
       <w:r>
         <w:rPr>
@@ -734,173 +900,512 @@
         </w:rPr>
         <w:t xml:space="preserve"> </w:t>
       </w:r>
-    </w:p>
-    <w:p>
-      <w:pPr>
-        <w:pStyle w:val="Paragraphedeliste"/>
-        <w:numPr>
-          <w:ilvl w:val="0"/>
-          <w:numId w:val="1"/>
-        </w:numPr>
-        <w:rPr>
-          <w:color w:val="000000" w:themeColor="text1"/>
-        </w:rPr>
-      </w:pPr>
-      <w:r>
-        <w:rPr>
-          <w:color w:val="000000" w:themeColor="text1"/>
-        </w:rPr>
-        <w:t>Cryptage</w:t>
-      </w:r>
-    </w:p>
-    <w:p>
-      <w:pPr>
-        <w:rPr>
-          <w:color w:val="000000" w:themeColor="text1"/>
-        </w:rPr>
-      </w:pPr>
-      <w:r>
-        <w:rPr>
-          <w:color w:val="000000" w:themeColor="text1"/>
-        </w:rPr>
-        <w:t>Tout d’abord nous créons le fichier contenant la clé si celui-ci n’existe pas, une fois fait on récupère le fichier que l’on transforme en binaire pour ensuite le crypter. Une fois celui-ci crypter nous le récupérons en sortie de programme avec un suffixe en plus.</w:t>
-      </w:r>
-    </w:p>
-    <w:p>
-      <w:pPr>
-        <w:pStyle w:val="Paragraphedeliste"/>
-        <w:numPr>
-          <w:ilvl w:val="0"/>
-          <w:numId w:val="1"/>
-        </w:numPr>
-        <w:rPr>
-          <w:color w:val="000000" w:themeColor="text1"/>
-        </w:rPr>
-      </w:pPr>
-      <w:r>
-        <w:rPr>
-          <w:color w:val="000000" w:themeColor="text1"/>
-        </w:rPr>
-        <w:t>Décryptage</w:t>
-      </w:r>
-    </w:p>
-    <w:p>
-      <w:pPr>
-        <w:rPr>
-          <w:color w:val="000000" w:themeColor="text1"/>
-        </w:rPr>
-      </w:pPr>
-      <w:r>
-        <w:rPr>
-          <w:color w:val="000000" w:themeColor="text1"/>
-        </w:rPr>
-        <w:t>Tout d’abord il y a une première fonction sui permet de récupérer le fichier clé du fichier, une fois récupérer la fonction de décryptage intervient. Celle-ci récupère le fichier ainsi que le fichier clé, il parcourt ensuite le document afin d’obtenir la clé correspondant au fichier, il l’utilise ensuite pour déchiffrer le fichier afin de nous le retourner comme d’origine.</w:t>
-      </w:r>
-    </w:p>
-    <w:p>
-      <w:pPr>
-        <w:pStyle w:val="Paragraphedeliste"/>
-        <w:numPr>
-          <w:ilvl w:val="0"/>
-          <w:numId w:val="1"/>
-        </w:numPr>
-        <w:rPr>
-          <w:color w:val="000000" w:themeColor="text1"/>
-        </w:rPr>
-      </w:pPr>
-      <w:r>
-        <w:rPr>
-          <w:color w:val="000000" w:themeColor="text1"/>
-        </w:rPr>
-        <w:t>Programme principal</w:t>
-      </w:r>
-    </w:p>
-    <w:p>
-      <w:pPr>
-        <w:rPr>
-          <w:color w:val="000000" w:themeColor="text1"/>
-        </w:rPr>
-      </w:pPr>
-      <w:r>
-        <w:rPr>
-          <w:color w:val="000000" w:themeColor="text1"/>
-        </w:rPr>
-        <w:t xml:space="preserve">Le programme principal contient lui l’interface graphique. Celle-ci est composé de 5 boutons qui appelle chacun une fonction bien précise. Les boutons de choix permettent de choisir le fichier ainsi que les différents dossiers. </w:t>
-      </w:r>
-      <w:r>
-        <w:rPr>
-          <w:color w:val="000000" w:themeColor="text1"/>
-        </w:rPr>
-        <w:t xml:space="preserve">Les boutons de cryptage et décryptage eux sont relié aux </w:t>
-      </w:r>
-      <w:r>
-        <w:rPr>
-          <w:color w:val="000000" w:themeColor="text1"/>
-        </w:rPr>
-        <w:t>deux fonctions les plus importante</w:t>
-      </w:r>
-      <w:r>
-        <w:rPr>
-          <w:color w:val="000000" w:themeColor="text1"/>
-        </w:rPr>
-        <w:t>,</w:t>
-      </w:r>
-      <w:r>
-        <w:rPr>
-          <w:color w:val="000000" w:themeColor="text1"/>
-        </w:rPr>
-        <w:t xml:space="preserve"> celles qui appelle les fonctions de cryptage et de décryptage des autres programmes</w:t>
-      </w:r>
-      <w:r>
-        <w:rPr>
-          <w:color w:val="000000" w:themeColor="text1"/>
-        </w:rPr>
-        <w:t>, ainsi que les fonctions utilisées par tous les autres boutons</w:t>
-      </w:r>
-      <w:r>
-        <w:rPr>
-          <w:color w:val="000000" w:themeColor="text1"/>
-        </w:rPr>
-        <w:t>.</w:t>
-      </w:r>
-      <w:r>
-        <w:rPr>
-          <w:color w:val="000000" w:themeColor="text1"/>
-        </w:rPr>
-        <w:t xml:space="preserve"> Ils permettent à partir du fichier et des dossier sélectionné</w:t>
-      </w:r>
-      <w:r>
-        <w:rPr>
-          <w:color w:val="000000" w:themeColor="text1"/>
-        </w:rPr>
-        <w:t>s</w:t>
-      </w:r>
-      <w:r>
-        <w:rPr>
-          <w:color w:val="000000" w:themeColor="text1"/>
-        </w:rPr>
-        <w:t xml:space="preserve"> de crypter ou décrypter le fichier voulu.</w:t>
-      </w:r>
-    </w:p>
-    <w:p>
-      <w:pPr>
-        <w:rPr>
-          <w:color w:val="000000" w:themeColor="text1"/>
-        </w:rPr>
-      </w:pPr>
-    </w:p>
-    <w:p>
-      <w:pPr>
-        <w:rPr>
-          <w:color w:val="000000" w:themeColor="text1"/>
-        </w:rPr>
-      </w:pPr>
-      <w:r>
-        <w:rPr>
-          <w:color w:val="000000" w:themeColor="text1"/>
-        </w:rPr>
-        <w:t>Afin de pouvoir partager la clé de cryptage nous avons decidé de crypter ce fichier d’une manieres plus simple avec simplement un decalage d’une certaine données de chgaque bytes de la clé de cryptage ce qui ne nécessite aucune clé de decryptage seulement le décalage utilisé a connaitre.</w:t>
-      </w:r>
+      <w:r>
+        <w:rPr>
+          <w:color w:val="000000" w:themeColor="text1"/>
+        </w:rPr>
+        <w:t>Pour ce qui est du dernier fichier nous en parlerons un peu plus tard.</w:t>
+      </w:r>
+    </w:p>
+    <w:p>
+      <w:pPr>
+        <w:rPr>
+          <w:color w:val="000000" w:themeColor="text1"/>
+        </w:rPr>
+      </w:pPr>
+      <w:r>
+        <w:rPr>
+          <w:color w:val="000000" w:themeColor="text1"/>
+        </w:rPr>
+        <w:t>Tout d’abord le fichier de cryptage.</w:t>
+      </w:r>
+    </w:p>
+    <w:p>
+      <w:pPr>
+        <w:rPr>
+          <w:color w:val="000000" w:themeColor="text1"/>
+        </w:rPr>
+      </w:pPr>
+      <w:r>
+        <w:rPr>
+          <w:color w:val="000000" w:themeColor="text1"/>
+        </w:rPr>
+        <w:t xml:space="preserve">Celui-ci contient seulement une fonction, celle qui permet de crypter. Celle-ci est structuré d’une façon assez simple. Tout d’abord </w:t>
+      </w:r>
+      <w:r>
+        <w:rPr>
+          <w:color w:val="000000" w:themeColor="text1"/>
+        </w:rPr>
+        <w:t xml:space="preserve">la fonction commence par la génération d’un fichier de stockage pour les clés ou bien si celui si existe déjà le programme le récupère afin de pouvoir écrire </w:t>
+      </w:r>
+      <w:r>
+        <w:rPr>
+          <w:color w:val="000000" w:themeColor="text1"/>
+        </w:rPr>
+        <w:t>la nouvelle clé</w:t>
+      </w:r>
+      <w:r>
+        <w:rPr>
+          <w:color w:val="000000" w:themeColor="text1"/>
+        </w:rPr>
+        <w:t xml:space="preserve"> dedans si nécessaire.</w:t>
+      </w:r>
+      <w:r>
+        <w:rPr>
+          <w:color w:val="000000" w:themeColor="text1"/>
+        </w:rPr>
+        <w:t xml:space="preserve"> Apres cela le programme lie le fichier donné et le converti en bytes. Une fois cela fait le fichier est crypté avec sa clé généré ou bien récupéré ultérieurement. Il suffit simplement par la suite de récupérer la base du fichier afin de </w:t>
+      </w:r>
+      <w:r>
+        <w:rPr>
+          <w:color w:val="000000" w:themeColor="text1"/>
+        </w:rPr>
+        <w:t>l’ajouter</w:t>
+      </w:r>
+      <w:r>
+        <w:rPr>
+          <w:color w:val="000000" w:themeColor="text1"/>
+        </w:rPr>
+        <w:t xml:space="preserve"> un suffixe ici ‘_crypt’, nous ajoutons ce nom de fichier au reste du chemin afin de le </w:t>
+      </w:r>
+      <w:r>
+        <w:rPr>
+          <w:color w:val="000000" w:themeColor="text1"/>
+        </w:rPr>
+        <w:t>récupérer</w:t>
+      </w:r>
+      <w:r>
+        <w:rPr>
+          <w:color w:val="000000" w:themeColor="text1"/>
+        </w:rPr>
+        <w:t xml:space="preserve"> pour le retourner </w:t>
+      </w:r>
+      <w:r>
+        <w:rPr>
+          <w:color w:val="000000" w:themeColor="text1"/>
+        </w:rPr>
+        <w:t>à</w:t>
+      </w:r>
+      <w:r>
+        <w:rPr>
+          <w:color w:val="000000" w:themeColor="text1"/>
+        </w:rPr>
+        <w:t xml:space="preserve"> la fin de la fonction. Entre temps nous avons pris soin de rajouter la fonction os.remove(fichier) qui nous permet du supprimer le fichier original afin de garder seulement le fichier crypté.</w:t>
+      </w:r>
+    </w:p>
+    <w:p>
+      <w:pPr>
+        <w:rPr>
+          <w:color w:val="000000" w:themeColor="text1"/>
+        </w:rPr>
+      </w:pPr>
+      <w:r>
+        <w:rPr>
+          <w:color w:val="000000" w:themeColor="text1"/>
+        </w:rPr>
+        <w:t>Maintenant que nous avons le programme ce cryptage nous devons être en mesure de pouvoir décrypter pour cela nous devons créer le fichier contenant les fonctions nécessaires au décryptage.</w:t>
+      </w:r>
+    </w:p>
+    <w:p>
+      <w:pPr>
+        <w:rPr>
+          <w:color w:val="000000" w:themeColor="text1"/>
+        </w:rPr>
+      </w:pPr>
+      <w:r>
+        <w:rPr>
+          <w:color w:val="000000" w:themeColor="text1"/>
+        </w:rPr>
+        <w:t xml:space="preserve">Ce fichier contient lui deux fonctions. La première permettant de récupérer la clé associer au fichier. Celle-ci cherche dans le dossier donné si le fichier key.key existe si celui n’existe pas une erreur sera retourné. Si tout va bien et que le fichier existe alors le programme va le lire en ignorant les lignes vides et en séparant en deux variables chaque ligne de celui-ci. La première variable étant le nom du fichier et la seconde la clé qui lui est associé. Cela est possible grâce à la fonction .split(|). En effet lors de la </w:t>
+      </w:r>
+      <w:r>
+        <w:rPr>
+          <w:color w:val="000000" w:themeColor="text1"/>
+        </w:rPr>
+        <w:t>création</w:t>
+      </w:r>
+      <w:r>
+        <w:rPr>
+          <w:color w:val="000000" w:themeColor="text1"/>
+        </w:rPr>
+        <w:t xml:space="preserve"> le fichier et la clé sont </w:t>
+      </w:r>
+      <w:r>
+        <w:rPr>
+          <w:color w:val="000000" w:themeColor="text1"/>
+        </w:rPr>
+        <w:t>séparé</w:t>
+      </w:r>
+      <w:r>
+        <w:rPr>
+          <w:color w:val="000000" w:themeColor="text1"/>
+        </w:rPr>
+        <w:t xml:space="preserve"> par une barre ce qui nous permet de dire au programme la séparation entre les deux afin de bien </w:t>
+      </w:r>
+      <w:r>
+        <w:rPr>
+          <w:color w:val="000000" w:themeColor="text1"/>
+        </w:rPr>
+        <w:t>réalisé</w:t>
+      </w:r>
+      <w:r>
+        <w:rPr>
+          <w:color w:val="000000" w:themeColor="text1"/>
+        </w:rPr>
+        <w:t xml:space="preserve"> celle-ci.</w:t>
+      </w:r>
+      <w:r>
+        <w:rPr>
+          <w:color w:val="000000" w:themeColor="text1"/>
+        </w:rPr>
+        <w:t xml:space="preserve"> </w:t>
+      </w:r>
+      <w:r>
+        <w:rPr>
+          <w:color w:val="000000" w:themeColor="text1"/>
+        </w:rPr>
+        <w:lastRenderedPageBreak/>
+        <w:t xml:space="preserve">Grace a cela nous récupérons la bonne clé pour le décryptage. Le décryptage lui est réalisé dans une deuxième fonction assez simple. Celle-ci récupère la clé donnée par la fonction d’avant dans ses paramètres, elle </w:t>
+      </w:r>
+      <w:r>
+        <w:rPr>
+          <w:color w:val="000000" w:themeColor="text1"/>
+        </w:rPr>
+        <w:t>récupère</w:t>
+      </w:r>
+      <w:r>
+        <w:rPr>
+          <w:color w:val="000000" w:themeColor="text1"/>
+        </w:rPr>
+        <w:t xml:space="preserve"> ensuite le fichier chiffré, test pour voir si celui-ci existe bien et si cela est le cas alors il va le lire en binaire afin de l’assigner a une variable. Celle-ci est ensuite utiliser dans la fonction de décryptage de fernet afin d’obtenir le fichier </w:t>
+      </w:r>
+      <w:r>
+        <w:rPr>
+          <w:color w:val="000000" w:themeColor="text1"/>
+        </w:rPr>
+        <w:t>décrypter</w:t>
+      </w:r>
+      <w:r>
+        <w:rPr>
+          <w:color w:val="000000" w:themeColor="text1"/>
+        </w:rPr>
+        <w:t xml:space="preserve">. Une fois cela </w:t>
+      </w:r>
+      <w:r>
+        <w:rPr>
+          <w:color w:val="000000" w:themeColor="text1"/>
+        </w:rPr>
+        <w:t>fait</w:t>
+      </w:r>
+      <w:r>
+        <w:rPr>
+          <w:color w:val="000000" w:themeColor="text1"/>
+        </w:rPr>
+        <w:t xml:space="preserve">, comme pour le cryptage, nous </w:t>
+      </w:r>
+      <w:r>
+        <w:rPr>
+          <w:color w:val="000000" w:themeColor="text1"/>
+        </w:rPr>
+        <w:t>récupérons</w:t>
+      </w:r>
+      <w:r>
+        <w:rPr>
+          <w:color w:val="000000" w:themeColor="text1"/>
+        </w:rPr>
+        <w:t xml:space="preserve"> la base du fichier a </w:t>
+      </w:r>
+      <w:r>
+        <w:rPr>
+          <w:color w:val="000000" w:themeColor="text1"/>
+        </w:rPr>
+        <w:t>laquelle</w:t>
+      </w:r>
+      <w:r>
+        <w:rPr>
+          <w:color w:val="000000" w:themeColor="text1"/>
+        </w:rPr>
+        <w:t xml:space="preserve"> nous supprimons le ‘_</w:t>
+      </w:r>
+      <w:r>
+        <w:rPr>
+          <w:color w:val="000000" w:themeColor="text1"/>
+        </w:rPr>
+        <w:t>crypt</w:t>
+      </w:r>
+      <w:r>
+        <w:rPr>
+          <w:color w:val="000000" w:themeColor="text1"/>
+        </w:rPr>
+        <w:t xml:space="preserve">’ et si le fichier n’en contenant pas nous lui rajoutons le </w:t>
+      </w:r>
+      <w:r>
+        <w:rPr>
+          <w:color w:val="000000" w:themeColor="text1"/>
+        </w:rPr>
+        <w:t>préfix</w:t>
+      </w:r>
+      <w:r>
+        <w:rPr>
+          <w:color w:val="000000" w:themeColor="text1"/>
+        </w:rPr>
+        <w:t xml:space="preserve"> ‘decrypted_’ une fois cela fait nous supprimons le fichier crypter et </w:t>
+      </w:r>
+      <w:r>
+        <w:rPr>
+          <w:color w:val="000000" w:themeColor="text1"/>
+        </w:rPr>
+        <w:t>retournons le chemin d’enregistrement du fichier une fois déchiffré.</w:t>
+      </w:r>
+    </w:p>
+    <w:p>
+      <w:pPr>
+        <w:rPr>
+          <w:color w:val="000000" w:themeColor="text1"/>
+        </w:rPr>
+      </w:pPr>
+      <w:r>
+        <w:rPr>
+          <w:color w:val="000000" w:themeColor="text1"/>
+        </w:rPr>
+        <w:t>Pour finir il faut maintenant parler du cœur du programme, celui qui utilise tout ce que l’on a créé auparavant. Le programme principal.</w:t>
+      </w:r>
+    </w:p>
+    <w:p>
+      <w:pPr>
+        <w:rPr>
+          <w:color w:val="000000" w:themeColor="text1"/>
+        </w:rPr>
+      </w:pPr>
+      <w:r>
+        <w:rPr>
+          <w:color w:val="000000" w:themeColor="text1"/>
+        </w:rPr>
+        <w:t xml:space="preserve">Celui-ci est composé de plusieurs fonctions. Le fichier contient une fonction pour chacun des boutons présents sur l’interface graphique. Tout d’abord les deux fonctions qui permettent le cryptage et le décryptage celles-ci utilise les fonctions écrites dans les deux autres fichiers. Il y a ensuite 3 autres fonctions pour le bouton de choix de fichier, choix de dossier et enfin choix du dossier de la clé. Il y a ensuite </w:t>
+      </w:r>
+      <w:r>
+        <w:rPr>
+          <w:color w:val="000000" w:themeColor="text1"/>
+        </w:rPr>
+        <w:t>à</w:t>
+      </w:r>
+      <w:r>
+        <w:rPr>
+          <w:color w:val="000000" w:themeColor="text1"/>
+        </w:rPr>
+        <w:t xml:space="preserve"> la fin du programme </w:t>
+      </w:r>
+      <w:r>
+        <w:rPr>
+          <w:color w:val="000000" w:themeColor="text1"/>
+        </w:rPr>
+        <w:t>la différente variable nécessaire</w:t>
+      </w:r>
+      <w:r>
+        <w:rPr>
+          <w:color w:val="000000" w:themeColor="text1"/>
+        </w:rPr>
+        <w:t xml:space="preserve"> a la </w:t>
+      </w:r>
+      <w:r>
+        <w:rPr>
+          <w:color w:val="000000" w:themeColor="text1"/>
+        </w:rPr>
+        <w:t>création</w:t>
+      </w:r>
+      <w:r>
+        <w:rPr>
+          <w:color w:val="000000" w:themeColor="text1"/>
+        </w:rPr>
+        <w:t xml:space="preserve"> </w:t>
+      </w:r>
+      <w:r>
+        <w:rPr>
+          <w:color w:val="000000" w:themeColor="text1"/>
+        </w:rPr>
+        <w:t>de la page</w:t>
+      </w:r>
+      <w:r>
+        <w:rPr>
+          <w:color w:val="000000" w:themeColor="text1"/>
+        </w:rPr>
+        <w:t xml:space="preserve"> et de sa mise en forme.</w:t>
+      </w:r>
+    </w:p>
+    <w:p>
+      <w:pPr>
+        <w:rPr>
+          <w:color w:val="000000" w:themeColor="text1"/>
+        </w:rPr>
+      </w:pPr>
+      <w:r>
+        <w:rPr>
+          <w:color w:val="000000" w:themeColor="text1"/>
+        </w:rPr>
+        <w:t xml:space="preserve">Tout d’abord les deux fonctions pour les pages de cryptage et décryptage sont très similaire en effet celles-ci on besoin des mêmes données. Les deux commencent par une vérifier que l’utilisateur a bien choisis un fichier ainsi que les dossiers nécessaires, si cela est bon alors il va utiliser ses données en faisant appelle aux fonctions des programmes antérieurs afin de crypter ou bien décrypter en fonction de la fonction. Si un erreur ce produit lors du processus alors un message d’erreur apparaitra. </w:t>
+      </w:r>
+    </w:p>
+    <w:p>
+      <w:pPr>
+        <w:rPr>
+          <w:color w:val="000000" w:themeColor="text1"/>
+        </w:rPr>
+      </w:pPr>
+      <w:r>
+        <w:rPr>
+          <w:color w:val="000000" w:themeColor="text1"/>
+        </w:rPr>
+        <w:t>Les fonctions pour les boutons de fichier et dossiers sont identiques les seules différences sont les variables utiliser et les pages ouvertes. Pour le fichier une page de choix de fichier va s’ouvrir et pour les dossiers cela sera une page ou l’on ne voit que les dossiers.</w:t>
+      </w:r>
+    </w:p>
+    <w:p>
+      <w:pPr>
+        <w:rPr>
+          <w:color w:val="000000" w:themeColor="text1"/>
+        </w:rPr>
+      </w:pPr>
+      <w:r>
+        <w:rPr>
+          <w:color w:val="000000" w:themeColor="text1"/>
+        </w:rPr>
+        <w:t>Il y a ensuite la création de la page, son titre sa taille, le titre dans l’interface</w:t>
+      </w:r>
+      <w:r>
+        <w:rPr>
+          <w:color w:val="000000" w:themeColor="text1"/>
+        </w:rPr>
+        <w:t xml:space="preserve"> ainsi que les deux boutons de cryptage décryptage et ensuite les différentes variables nécessaires pour les boutons de fichiers de dossier ainsi que leur bouton. La dernière ligne du programme nous permet elle de lancer l’interface graphique.</w:t>
+      </w:r>
+    </w:p>
+    <w:p>
+      <w:pPr>
+        <w:rPr>
+          <w:color w:val="000000" w:themeColor="text1"/>
+        </w:rPr>
+      </w:pPr>
+      <w:r>
+        <w:rPr>
+          <w:color w:val="000000" w:themeColor="text1"/>
+        </w:rPr>
+        <w:t>Pour finir nous avons réalisé un dernier programme complètement indépendant du reste avec sa propre interface graphique.</w:t>
+      </w:r>
+    </w:p>
+    <w:p>
+      <w:pPr>
+        <w:rPr>
+          <w:color w:val="000000" w:themeColor="text1"/>
+        </w:rPr>
+      </w:pPr>
+      <w:r>
+        <w:rPr>
+          <w:color w:val="000000" w:themeColor="text1"/>
+        </w:rPr>
+        <w:t xml:space="preserve">Afin de pouvoir partager la clé de cryptage nous avons </w:t>
+      </w:r>
+      <w:r>
+        <w:rPr>
+          <w:color w:val="000000" w:themeColor="text1"/>
+        </w:rPr>
+        <w:t>décidé</w:t>
+      </w:r>
+      <w:r>
+        <w:rPr>
+          <w:color w:val="000000" w:themeColor="text1"/>
+        </w:rPr>
+        <w:t xml:space="preserve"> de crypter ce fichier </w:t>
+      </w:r>
+      <w:r>
+        <w:rPr>
+          <w:color w:val="000000" w:themeColor="text1"/>
+        </w:rPr>
+        <w:t>d’une manière</w:t>
+      </w:r>
+      <w:r>
+        <w:rPr>
+          <w:color w:val="000000" w:themeColor="text1"/>
+        </w:rPr>
+        <w:t xml:space="preserve"> plus simple avec simplement un </w:t>
+      </w:r>
+      <w:r>
+        <w:rPr>
+          <w:color w:val="000000" w:themeColor="text1"/>
+        </w:rPr>
+        <w:t>décalage</w:t>
+      </w:r>
+      <w:r>
+        <w:rPr>
+          <w:color w:val="000000" w:themeColor="text1"/>
+        </w:rPr>
+        <w:t xml:space="preserve"> </w:t>
+      </w:r>
+      <w:r>
+        <w:rPr>
+          <w:color w:val="000000" w:themeColor="text1"/>
+        </w:rPr>
+        <w:t>d’une certaine donnée</w:t>
+      </w:r>
+      <w:r>
+        <w:rPr>
+          <w:color w:val="000000" w:themeColor="text1"/>
+        </w:rPr>
+        <w:t xml:space="preserve"> de </w:t>
+      </w:r>
+      <w:r>
+        <w:rPr>
+          <w:color w:val="000000" w:themeColor="text1"/>
+        </w:rPr>
+        <w:t>chaque</w:t>
+      </w:r>
+      <w:r>
+        <w:rPr>
+          <w:color w:val="000000" w:themeColor="text1"/>
+        </w:rPr>
+        <w:t xml:space="preserve"> </w:t>
+      </w:r>
+      <w:r>
+        <w:rPr>
+          <w:color w:val="000000" w:themeColor="text1"/>
+        </w:rPr>
+        <w:t>byte</w:t>
+      </w:r>
+      <w:r>
+        <w:rPr>
+          <w:color w:val="000000" w:themeColor="text1"/>
+        </w:rPr>
+        <w:t xml:space="preserve"> de la clé de cryptage ce qui ne nécessite aucune clé de </w:t>
+      </w:r>
+      <w:r>
+        <w:rPr>
+          <w:color w:val="000000" w:themeColor="text1"/>
+        </w:rPr>
+        <w:t>décryptage</w:t>
+      </w:r>
+      <w:r>
+        <w:rPr>
+          <w:color w:val="000000" w:themeColor="text1"/>
+        </w:rPr>
+        <w:t xml:space="preserve"> seulement le décalage utilisé </w:t>
+      </w:r>
+      <w:r>
+        <w:rPr>
+          <w:color w:val="000000" w:themeColor="text1"/>
+        </w:rPr>
+        <w:t>à</w:t>
+      </w:r>
+      <w:r>
+        <w:rPr>
+          <w:color w:val="000000" w:themeColor="text1"/>
+        </w:rPr>
+        <w:t xml:space="preserve"> connaitre.</w:t>
+      </w:r>
+    </w:p>
+    <w:bookmarkEnd w:id="1"/>
+    <w:p>
+      <w:pPr>
+        <w:rPr>
+          <w:color w:val="000000" w:themeColor="text1"/>
+        </w:rPr>
+      </w:pPr>
     </w:p>
     <w:p>
       <w:pPr>

</xml_diff>